<commit_message>
Agrego DFDs al Word
</commit_message>
<xml_diff>
--- a/DocDelProyectoGarciaDelfabro.docx
+++ b/DocDelProyectoGarciaDelfabro.docx
@@ -375,7 +375,7 @@
                   </wp:anchor>
                 </w:drawing>
               </mc:Choice>
-              <mc:Fallback xmlns:w16sdtfl="http://schemas.microsoft.com/office/word/2024/wordml/sdtformatlock" xmlns:w16sdtdh="http://schemas.microsoft.com/office/word/2020/wordml/sdtdatahash" xmlns:w16du="http://schemas.microsoft.com/office/word/2023/wordml/word16du" xmlns:w16="http://schemas.microsoft.com/office/word/2018/wordml" xmlns:w16cid="http://schemas.microsoft.com/office/word/2016/wordml/cid" xmlns:w16cex="http://schemas.microsoft.com/office/word/2018/wordml/cex" xmlns:oel="http://schemas.microsoft.com/office/2019/extlst" xmlns:am3d="http://schemas.microsoft.com/office/drawing/2017/model3d" xmlns:aink="http://schemas.microsoft.com/office/drawing/2016/ink" xmlns:cx8="http://schemas.microsoft.com/office/drawing/2016/5/14/chartex" xmlns:cx7="http://schemas.microsoft.com/office/drawing/2016/5/13/chartex" xmlns:cx6="http://schemas.microsoft.com/office/drawing/2016/5/12/chartex" xmlns:cx5="http://schemas.microsoft.com/office/drawing/2016/5/11/chartex" xmlns:cx4="http://schemas.microsoft.com/office/drawing/2016/5/10/chartex" xmlns:cx3="http://schemas.microsoft.com/office/drawing/2016/5/9/chartex" xmlns:cx2="http://schemas.microsoft.com/office/drawing/2015/10/21/chartex">
+              <mc:Fallback xmlns:cx2="http://schemas.microsoft.com/office/drawing/2015/10/21/chartex" xmlns:cx3="http://schemas.microsoft.com/office/drawing/2016/5/9/chartex" xmlns:cx4="http://schemas.microsoft.com/office/drawing/2016/5/10/chartex" xmlns:cx5="http://schemas.microsoft.com/office/drawing/2016/5/11/chartex" xmlns:cx6="http://schemas.microsoft.com/office/drawing/2016/5/12/chartex" xmlns:cx7="http://schemas.microsoft.com/office/drawing/2016/5/13/chartex" xmlns:cx8="http://schemas.microsoft.com/office/drawing/2016/5/14/chartex" xmlns:aink="http://schemas.microsoft.com/office/drawing/2016/ink" xmlns:am3d="http://schemas.microsoft.com/office/drawing/2017/model3d" xmlns:oel="http://schemas.microsoft.com/office/2019/extlst" xmlns:w16cex="http://schemas.microsoft.com/office/word/2018/wordml/cex" xmlns:w16cid="http://schemas.microsoft.com/office/word/2016/wordml/cid" xmlns:w16="http://schemas.microsoft.com/office/word/2018/wordml" xmlns:w16du="http://schemas.microsoft.com/office/word/2023/wordml/word16du" xmlns:w16sdtdh="http://schemas.microsoft.com/office/word/2020/wordml/sdtdatahash" xmlns:w16sdtfl="http://schemas.microsoft.com/office/word/2024/wordml/sdtformatlock">
                 <w:pict>
                   <v:rect w14:anchorId="07684F74" id="Rectángulo 261" o:spid="_x0000_s1026" style="position:absolute;margin-left:0;margin-top:0;width:244.8pt;height:554.4pt;z-index:251659264;visibility:visible;mso-wrap-style:square;mso-width-percent:400;mso-height-percent:700;mso-left-percent:440;mso-top-percent:25;mso-wrap-distance-left:9pt;mso-wrap-distance-top:0;mso-wrap-distance-right:9pt;mso-wrap-distance-bottom:0;mso-position-horizontal-relative:page;mso-position-vertical-relative:page;mso-width-percent:400;mso-height-percent:700;mso-left-percent:440;mso-top-percent:25;mso-width-relative:page;mso-height-relative:page;v-text-anchor:middle" o:gfxdata="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" fillcolor="white [3212]" strokecolor="#747070 [1614]" strokeweight="1.25pt">
                     <w10:wrap anchorx="page" anchory="page"/>
@@ -473,7 +473,7 @@
                   </wp:anchor>
                 </w:drawing>
               </mc:Choice>
-              <mc:Fallback xmlns:w16sdtfl="http://schemas.microsoft.com/office/word/2024/wordml/sdtformatlock" xmlns:w16sdtdh="http://schemas.microsoft.com/office/word/2020/wordml/sdtdatahash" xmlns:w16du="http://schemas.microsoft.com/office/word/2023/wordml/word16du" xmlns:w16="http://schemas.microsoft.com/office/word/2018/wordml" xmlns:w16cid="http://schemas.microsoft.com/office/word/2016/wordml/cid" xmlns:w16cex="http://schemas.microsoft.com/office/word/2018/wordml/cex" xmlns:oel="http://schemas.microsoft.com/office/2019/extlst" xmlns:am3d="http://schemas.microsoft.com/office/drawing/2017/model3d" xmlns:aink="http://schemas.microsoft.com/office/drawing/2016/ink" xmlns:cx8="http://schemas.microsoft.com/office/drawing/2016/5/14/chartex" xmlns:cx7="http://schemas.microsoft.com/office/drawing/2016/5/13/chartex" xmlns:cx6="http://schemas.microsoft.com/office/drawing/2016/5/12/chartex" xmlns:cx5="http://schemas.microsoft.com/office/drawing/2016/5/11/chartex" xmlns:cx4="http://schemas.microsoft.com/office/drawing/2016/5/10/chartex" xmlns:cx3="http://schemas.microsoft.com/office/drawing/2016/5/9/chartex" xmlns:cx2="http://schemas.microsoft.com/office/drawing/2015/10/21/chartex">
+              <mc:Fallback xmlns:cx2="http://schemas.microsoft.com/office/drawing/2015/10/21/chartex" xmlns:cx3="http://schemas.microsoft.com/office/drawing/2016/5/9/chartex" xmlns:cx4="http://schemas.microsoft.com/office/drawing/2016/5/10/chartex" xmlns:cx5="http://schemas.microsoft.com/office/drawing/2016/5/11/chartex" xmlns:cx6="http://schemas.microsoft.com/office/drawing/2016/5/12/chartex" xmlns:cx7="http://schemas.microsoft.com/office/drawing/2016/5/13/chartex" xmlns:cx8="http://schemas.microsoft.com/office/drawing/2016/5/14/chartex" xmlns:aink="http://schemas.microsoft.com/office/drawing/2016/ink" xmlns:am3d="http://schemas.microsoft.com/office/drawing/2017/model3d" xmlns:oel="http://schemas.microsoft.com/office/2019/extlst" xmlns:w16cex="http://schemas.microsoft.com/office/word/2018/wordml/cex" xmlns:w16cid="http://schemas.microsoft.com/office/word/2016/wordml/cid" xmlns:w16="http://schemas.microsoft.com/office/word/2018/wordml" xmlns:w16du="http://schemas.microsoft.com/office/word/2023/wordml/word16du" xmlns:w16sdtdh="http://schemas.microsoft.com/office/word/2020/wordml/sdtdatahash" xmlns:w16sdtfl="http://schemas.microsoft.com/office/word/2024/wordml/sdtformatlock">
                 <w:pict>
                   <v:rect w14:anchorId="00A61A94" id="Rectángulo 263" o:spid="_x0000_s1026" style="position:absolute;margin-left:0;margin-top:0;width:226.45pt;height:9.35pt;z-index:251662336;visibility:visible;mso-wrap-style:square;mso-width-percent:370;mso-height-percent:0;mso-left-percent:455;mso-top-percent:690;mso-wrap-distance-left:9pt;mso-wrap-distance-top:0;mso-wrap-distance-right:9pt;mso-wrap-distance-bottom:0;mso-position-horizontal-relative:page;mso-position-vertical-relative:page;mso-width-percent:370;mso-height-percent:0;mso-left-percent:455;mso-top-percent:690;mso-width-relative:page;mso-height-relative:margin;v-text-anchor:middle" o:gfxdata="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" fillcolor="#9a0000 [3204]" stroked="f" strokeweight="1pt">
                     <w10:wrap anchorx="page" anchory="page"/>
@@ -659,7 +659,7 @@
                                         </pic:cNvPicPr>
                                       </pic:nvPicPr>
                                       <pic:blipFill>
-                                        <a:blip r:embed="rId6">
+                                        <a:blip r:embed="rId7">
                                           <a:extLst>
                                             <a:ext uri="{28A0092B-C50C-407E-A947-70E740481C1C}">
                                               <a14:useLocalDpi xmlns:a14="http://schemas.microsoft.com/office/drawing/2010/main" val="0"/>
@@ -773,16 +773,7 @@
                                         <w:sz w:val="60"/>
                                         <w:szCs w:val="60"/>
                                       </w:rPr>
-                                      <w:t xml:space="preserve">Sistema De Gestión de Ventas </w:t>
-                                    </w:r>
-                                    <w:r>
-                                      <w:rPr>
-                                        <w:rFonts w:asciiTheme="majorHAnsi" w:eastAsiaTheme="majorEastAsia" w:hAnsiTheme="majorHAnsi" w:cstheme="majorBidi"/>
-                                        <w:color w:val="9A0000" w:themeColor="accent1"/>
-                                        <w:sz w:val="60"/>
-                                        <w:szCs w:val="60"/>
-                                      </w:rPr>
-                                      <w:t xml:space="preserve">“Baluarte Data” </w:t>
+                                      <w:t>Sistema De Gestión de Ventas “Baluarte Data”</w:t>
                                     </w:r>
                                   </w:p>
                                 </w:sdtContent>
@@ -846,7 +837,11 @@
               </mc:Choice>
               <mc:Fallback>
                 <w:pict>
-                  <v:shape w14:anchorId="3FA0420C" id="Cuadro de texto 265" o:spid="_x0000_s1029" type="#_x0000_t202" style="position:absolute;margin-left:278.2pt;margin-top:332.95pt;width:207.95pt;height:194.9pt;z-index:251661312;visibility:visible;mso-wrap-style:square;mso-width-percent:0;mso-height-percent:280;mso-wrap-distance-left:9pt;mso-wrap-distance-top:0;mso-wrap-distance-right:9pt;mso-wrap-distance-bottom:0;mso-position-horizontal:absolute;mso-position-horizontal-relative:page;mso-position-vertical:absolute;mso-position-vertical-relative:page;mso-width-percent:0;mso-height-percent:280;mso-width-relative:page;mso-height-relative:page;v-text-anchor:top" o:gfxdata="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" filled="f" stroked="f" strokeweight=".5pt">
+                  <v:shapetype w14:anchorId="3FA0420C" id="_x0000_t202" coordsize="21600,21600" o:spt="202" path="m,l,21600r21600,l21600,xe">
+                    <v:stroke joinstyle="miter"/>
+                    <v:path gradientshapeok="t" o:connecttype="rect"/>
+                  </v:shapetype>
+                  <v:shape id="Cuadro de texto 265" o:spid="_x0000_s1029" type="#_x0000_t202" style="position:absolute;margin-left:278.2pt;margin-top:332.95pt;width:207.95pt;height:194.9pt;z-index:251661312;visibility:visible;mso-wrap-style:square;mso-width-percent:0;mso-height-percent:280;mso-wrap-distance-left:9pt;mso-wrap-distance-top:0;mso-wrap-distance-right:9pt;mso-wrap-distance-bottom:0;mso-position-horizontal:absolute;mso-position-horizontal-relative:page;mso-position-vertical:absolute;mso-position-vertical-relative:page;mso-width-percent:0;mso-height-percent:280;mso-width-relative:page;mso-height-relative:page;v-text-anchor:top" o:gfxdata="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" filled="f" stroked="f" strokeweight=".5pt">
                     <v:textbox style="mso-fit-shape-to-text:t">
                       <w:txbxContent>
                         <w:sdt>
@@ -882,16 +877,7 @@
                                   <w:sz w:val="60"/>
                                   <w:szCs w:val="60"/>
                                 </w:rPr>
-                                <w:t xml:space="preserve">Sistema De Gestión de Ventas </w:t>
-                              </w:r>
-                              <w:r>
-                                <w:rPr>
-                                  <w:rFonts w:asciiTheme="majorHAnsi" w:eastAsiaTheme="majorEastAsia" w:hAnsiTheme="majorHAnsi" w:cstheme="majorBidi"/>
-                                  <w:color w:val="9A0000" w:themeColor="accent1"/>
-                                  <w:sz w:val="60"/>
-                                  <w:szCs w:val="60"/>
-                                </w:rPr>
-                                <w:t xml:space="preserve">“Baluarte Data” </w:t>
+                                <w:t>Sistema De Gestión de Ventas “Baluarte Data”</w:t>
                               </w:r>
                             </w:p>
                           </w:sdtContent>
@@ -1597,13 +1583,7 @@
         <w:rPr>
           <w:lang w:val="es-ES"/>
         </w:rPr>
-        <w:t>1.4</w:t>
-      </w:r>
-      <w:r>
-        <w:rPr>
-          <w:lang w:val="es-ES"/>
-        </w:rPr>
-        <w:t>-</w:t>
+        <w:t>1.4-</w:t>
       </w:r>
       <w:r>
         <w:rPr>
@@ -1676,13 +1656,7 @@
         <w:rPr>
           <w:lang w:val="es-ES"/>
         </w:rPr>
-        <w:t>1.5</w:t>
-      </w:r>
-      <w:r>
-        <w:rPr>
-          <w:lang w:val="es-ES"/>
-        </w:rPr>
-        <w:t>-</w:t>
+        <w:t>1.5-</w:t>
       </w:r>
       <w:r>
         <w:rPr>
@@ -1751,13 +1725,7 @@
         <w:rPr>
           <w:lang w:val="es-ES"/>
         </w:rPr>
-        <w:t>1.6</w:t>
-      </w:r>
-      <w:r>
-        <w:rPr>
-          <w:lang w:val="es-ES"/>
-        </w:rPr>
-        <w:t>-</w:t>
+        <w:t>1.6-</w:t>
       </w:r>
       <w:r>
         <w:rPr>
@@ -1825,13 +1793,7 @@
         <w:rPr>
           <w:lang w:val="es-ES"/>
         </w:rPr>
-        <w:t>1.7</w:t>
-      </w:r>
-      <w:r>
-        <w:rPr>
-          <w:lang w:val="es-ES"/>
-        </w:rPr>
-        <w:t>-</w:t>
+        <w:t>1.7-</w:t>
       </w:r>
       <w:r>
         <w:rPr>
@@ -1851,15 +1813,7 @@
           <w:i/>
           <w:lang w:val="es-ES"/>
         </w:rPr>
-        <w:t xml:space="preserve">(1 </w:t>
-      </w:r>
-      <w:r>
-        <w:rPr>
-          <w:b/>
-          <w:i/>
-          <w:lang w:val="es-ES"/>
-        </w:rPr>
-        <w:t>Día)</w:t>
+        <w:t>(1 Día)</w:t>
       </w:r>
       <w:r>
         <w:rPr>
@@ -1980,13 +1934,7 @@
         <w:rPr>
           <w:lang w:val="es-ES"/>
         </w:rPr>
-        <w:t>2.1</w:t>
-      </w:r>
-      <w:r>
-        <w:rPr>
-          <w:lang w:val="es-ES"/>
-        </w:rPr>
-        <w:t>-</w:t>
+        <w:t>2.1-</w:t>
       </w:r>
       <w:r>
         <w:rPr>
@@ -2013,21 +1961,7 @@
           <w:b/>
           <w:i/>
         </w:rPr>
-        <w:t>28/10/2025-</w:t>
-      </w:r>
-      <w:r>
-        <w:rPr>
-          <w:b/>
-          <w:i/>
-        </w:rPr>
-        <w:t>28/10/2025</w:t>
-      </w:r>
-      <w:r>
-        <w:rPr>
-          <w:b/>
-          <w:i/>
-        </w:rPr>
-        <w:t>]</w:t>
+        <w:t>28/10/2025-28/10/2025]</w:t>
       </w:r>
     </w:p>
     <w:p>
@@ -2045,13 +1979,7 @@
         <w:rPr>
           <w:lang w:val="es-ES"/>
         </w:rPr>
-        <w:t>2.2</w:t>
-      </w:r>
-      <w:r>
-        <w:rPr>
-          <w:lang w:val="es-ES"/>
-        </w:rPr>
-        <w:t>-</w:t>
+        <w:t>2.2-</w:t>
       </w:r>
       <w:r>
         <w:rPr>
@@ -2086,21 +2014,7 @@
           <w:b/>
           <w:i/>
         </w:rPr>
-        <w:t>/10/2025-</w:t>
-      </w:r>
-      <w:r>
-        <w:rPr>
-          <w:b/>
-          <w:i/>
-        </w:rPr>
-        <w:t>28/10/2025</w:t>
-      </w:r>
-      <w:r>
-        <w:rPr>
-          <w:b/>
-          <w:i/>
-        </w:rPr>
-        <w:t>]</w:t>
+        <w:t>/10/2025-28/10/2025]</w:t>
       </w:r>
     </w:p>
     <w:p>
@@ -2120,13 +2034,7 @@
         <w:rPr>
           <w:lang w:val="es-ES"/>
         </w:rPr>
-        <w:t>2.3</w:t>
-      </w:r>
-      <w:r>
-        <w:rPr>
-          <w:lang w:val="es-ES"/>
-        </w:rPr>
-        <w:t>-</w:t>
+        <w:t>2.3-</w:t>
       </w:r>
       <w:r>
         <w:rPr>
@@ -2155,21 +2063,7 @@
           <w:b/>
           <w:i/>
         </w:rPr>
-        <w:t>29/10/2025-</w:t>
-      </w:r>
-      <w:r>
-        <w:rPr>
-          <w:b/>
-          <w:i/>
-        </w:rPr>
-        <w:t>29/10/2025</w:t>
-      </w:r>
-      <w:r>
-        <w:rPr>
-          <w:b/>
-          <w:i/>
-        </w:rPr>
-        <w:t>]</w:t>
+        <w:t>29/10/2025-29/10/2025]</w:t>
       </w:r>
     </w:p>
     <w:p>
@@ -2187,13 +2081,7 @@
         <w:rPr>
           <w:lang w:val="es-ES"/>
         </w:rPr>
-        <w:t>2.4</w:t>
-      </w:r>
-      <w:r>
-        <w:rPr>
-          <w:lang w:val="es-ES"/>
-        </w:rPr>
-        <w:t>-</w:t>
+        <w:t>2.4-</w:t>
       </w:r>
       <w:r>
         <w:rPr>
@@ -2222,21 +2110,7 @@
           <w:b/>
           <w:i/>
         </w:rPr>
-        <w:t>30/10/2025-</w:t>
-      </w:r>
-      <w:r>
-        <w:rPr>
-          <w:b/>
-          <w:i/>
-        </w:rPr>
-        <w:t>30/10/2025</w:t>
-      </w:r>
-      <w:r>
-        <w:rPr>
-          <w:b/>
-          <w:i/>
-        </w:rPr>
-        <w:t>]</w:t>
+        <w:t>30/10/2025-30/10/2025]</w:t>
       </w:r>
     </w:p>
     <w:p>
@@ -2254,13 +2128,7 @@
         <w:rPr>
           <w:lang w:val="es-ES"/>
         </w:rPr>
-        <w:t>2.5</w:t>
-      </w:r>
-      <w:r>
-        <w:rPr>
-          <w:lang w:val="es-ES"/>
-        </w:rPr>
-        <w:t>-</w:t>
+        <w:t>2.5-</w:t>
       </w:r>
       <w:r>
         <w:rPr>
@@ -2280,31 +2148,7 @@
           <w:i/>
           <w:lang w:val="es-ES"/>
         </w:rPr>
-        <w:t>(2</w:t>
-      </w:r>
-      <w:r>
-        <w:rPr>
-          <w:b/>
-          <w:i/>
-          <w:lang w:val="es-ES"/>
-        </w:rPr>
-        <w:t xml:space="preserve"> Día</w:t>
-      </w:r>
-      <w:r>
-        <w:rPr>
-          <w:b/>
-          <w:i/>
-          <w:lang w:val="es-ES"/>
-        </w:rPr>
-        <w:t>s</w:t>
-      </w:r>
-      <w:r>
-        <w:rPr>
-          <w:b/>
-          <w:i/>
-          <w:lang w:val="es-ES"/>
-        </w:rPr>
-        <w:t xml:space="preserve">) </w:t>
+        <w:t xml:space="preserve">(2 Días) </w:t>
       </w:r>
       <w:r>
         <w:rPr>
@@ -2319,21 +2163,7 @@
           <w:b/>
           <w:i/>
         </w:rPr>
-        <w:t>31/10/2025-</w:t>
-      </w:r>
-      <w:r>
-        <w:rPr>
-          <w:b/>
-          <w:i/>
-        </w:rPr>
-        <w:t>03/11/2025</w:t>
-      </w:r>
-      <w:r>
-        <w:rPr>
-          <w:b/>
-          <w:i/>
-        </w:rPr>
-        <w:t>]</w:t>
+        <w:t>31/10/2025-03/11/2025]</w:t>
       </w:r>
     </w:p>
     <w:p>
@@ -2406,18 +2236,7 @@
           <w:sz w:val="36"/>
           <w:szCs w:val="36"/>
         </w:rPr>
-        <w:t>(12</w:t>
-      </w:r>
-      <w:r>
-        <w:rPr>
-          <w:rFonts w:ascii="Verdana" w:hAnsi="Verdana"/>
-          <w:i/>
-          <w:iCs/>
-          <w:color w:val="000000" w:themeColor="text1"/>
-          <w:sz w:val="36"/>
-          <w:szCs w:val="36"/>
-        </w:rPr>
-        <w:t xml:space="preserve"> Días)</w:t>
+        <w:t>(12 Días)</w:t>
       </w:r>
     </w:p>
     <w:p>
@@ -2435,13 +2254,7 @@
         <w:rPr>
           <w:lang w:val="es-ES"/>
         </w:rPr>
-        <w:t>3</w:t>
-      </w:r>
-      <w:r>
-        <w:rPr>
-          <w:lang w:val="es-ES"/>
-        </w:rPr>
-        <w:t>.1-</w:t>
+        <w:t>3.1-</w:t>
       </w:r>
       <w:r>
         <w:rPr>
@@ -2482,21 +2295,7 @@
           <w:b/>
           <w:i/>
         </w:rPr>
-        <w:t>04/11/2025-</w:t>
-      </w:r>
-      <w:r>
-        <w:rPr>
-          <w:b/>
-          <w:i/>
-        </w:rPr>
-        <w:t>04/11/2025</w:t>
-      </w:r>
-      <w:r>
-        <w:rPr>
-          <w:b/>
-          <w:i/>
-        </w:rPr>
-        <w:t>]</w:t>
+        <w:t>04/11/2025-04/11/2025]</w:t>
       </w:r>
     </w:p>
     <w:p>
@@ -2514,19 +2313,7 @@
         <w:rPr>
           <w:lang w:val="es-ES"/>
         </w:rPr>
-        <w:t>3</w:t>
-      </w:r>
-      <w:r>
-        <w:rPr>
-          <w:lang w:val="es-ES"/>
-        </w:rPr>
-        <w:t>.2</w:t>
-      </w:r>
-      <w:r>
-        <w:rPr>
-          <w:lang w:val="es-ES"/>
-        </w:rPr>
-        <w:t>-</w:t>
+        <w:t>3.2-</w:t>
       </w:r>
       <w:r>
         <w:rPr>
@@ -2591,21 +2378,7 @@
           <w:b/>
           <w:i/>
         </w:rPr>
-        <w:t>05/11/2025-</w:t>
-      </w:r>
-      <w:r>
-        <w:rPr>
-          <w:b/>
-          <w:i/>
-        </w:rPr>
-        <w:t>07/11/2025</w:t>
-      </w:r>
-      <w:r>
-        <w:rPr>
-          <w:b/>
-          <w:i/>
-        </w:rPr>
-        <w:t>]</w:t>
+        <w:t>05/11/2025-07/11/2025]</w:t>
       </w:r>
     </w:p>
     <w:p>
@@ -2623,19 +2396,7 @@
         <w:rPr>
           <w:lang w:val="es-ES"/>
         </w:rPr>
-        <w:t>3</w:t>
-      </w:r>
-      <w:r>
-        <w:rPr>
-          <w:lang w:val="es-ES"/>
-        </w:rPr>
-        <w:t>.3</w:t>
-      </w:r>
-      <w:r>
-        <w:rPr>
-          <w:lang w:val="es-ES"/>
-        </w:rPr>
-        <w:t>-</w:t>
+        <w:t>3.3-</w:t>
       </w:r>
       <w:r>
         <w:rPr>
@@ -2680,21 +2441,7 @@
           <w:b/>
           <w:i/>
         </w:rPr>
-        <w:t>10/11/2025-</w:t>
-      </w:r>
-      <w:r>
-        <w:rPr>
-          <w:b/>
-          <w:i/>
-        </w:rPr>
-        <w:t>10/11/2025</w:t>
-      </w:r>
-      <w:r>
-        <w:rPr>
-          <w:b/>
-          <w:i/>
-        </w:rPr>
-        <w:t>]</w:t>
+        <w:t>10/11/2025-10/11/2025]</w:t>
       </w:r>
     </w:p>
     <w:p>
@@ -2714,19 +2461,7 @@
         <w:rPr>
           <w:lang w:val="es-ES"/>
         </w:rPr>
-        <w:t>3</w:t>
-      </w:r>
-      <w:r>
-        <w:rPr>
-          <w:lang w:val="es-ES"/>
-        </w:rPr>
-        <w:t>.4</w:t>
-      </w:r>
-      <w:r>
-        <w:rPr>
-          <w:lang w:val="es-ES"/>
-        </w:rPr>
-        <w:t>-</w:t>
+        <w:t>3.4-</w:t>
       </w:r>
       <w:r>
         <w:rPr>
@@ -2791,21 +2526,7 @@
           <w:b/>
           <w:i/>
         </w:rPr>
-        <w:t>11/11/2025-</w:t>
-      </w:r>
-      <w:r>
-        <w:rPr>
-          <w:b/>
-          <w:i/>
-        </w:rPr>
-        <w:t>12/11/2025</w:t>
-      </w:r>
-      <w:r>
-        <w:rPr>
-          <w:b/>
-          <w:i/>
-        </w:rPr>
-        <w:t>]</w:t>
+        <w:t>11/11/2025-12/11/2025]</w:t>
       </w:r>
     </w:p>
     <w:p>
@@ -2823,19 +2544,7 @@
         <w:rPr>
           <w:lang w:val="es-ES"/>
         </w:rPr>
-        <w:t>3</w:t>
-      </w:r>
-      <w:r>
-        <w:rPr>
-          <w:lang w:val="es-ES"/>
-        </w:rPr>
-        <w:t>.5</w:t>
-      </w:r>
-      <w:r>
-        <w:rPr>
-          <w:lang w:val="es-ES"/>
-        </w:rPr>
-        <w:t>-</w:t>
+        <w:t>3.5-</w:t>
       </w:r>
       <w:r>
         <w:rPr>
@@ -2886,21 +2595,7 @@
           <w:b/>
           <w:i/>
         </w:rPr>
-        <w:t>13/11/2025-</w:t>
-      </w:r>
-      <w:r>
-        <w:rPr>
-          <w:b/>
-          <w:i/>
-        </w:rPr>
-        <w:t>13/11/2025</w:t>
-      </w:r>
-      <w:r>
-        <w:rPr>
-          <w:b/>
-          <w:i/>
-        </w:rPr>
-        <w:t>]</w:t>
+        <w:t>13/11/2025-13/11/2025]</w:t>
       </w:r>
     </w:p>
     <w:p>
@@ -2918,19 +2613,7 @@
         <w:rPr>
           <w:lang w:val="es-ES"/>
         </w:rPr>
-        <w:t>3</w:t>
-      </w:r>
-      <w:r>
-        <w:rPr>
-          <w:lang w:val="es-ES"/>
-        </w:rPr>
-        <w:t>.6</w:t>
-      </w:r>
-      <w:r>
-        <w:rPr>
-          <w:lang w:val="es-ES"/>
-        </w:rPr>
-        <w:t>-</w:t>
+        <w:t>3.6-</w:t>
       </w:r>
       <w:r>
         <w:rPr>
@@ -2981,21 +2664,7 @@
           <w:b/>
           <w:i/>
         </w:rPr>
-        <w:t>14/11/2025-</w:t>
-      </w:r>
-      <w:r>
-        <w:rPr>
-          <w:b/>
-          <w:i/>
-        </w:rPr>
-        <w:t>14/11/2025</w:t>
-      </w:r>
-      <w:r>
-        <w:rPr>
-          <w:b/>
-          <w:i/>
-        </w:rPr>
-        <w:t>]</w:t>
+        <w:t>14/11/2025-14/11/2025]</w:t>
       </w:r>
     </w:p>
     <w:p>
@@ -3015,19 +2684,7 @@
         <w:rPr>
           <w:lang w:val="es-ES"/>
         </w:rPr>
-        <w:t>3</w:t>
-      </w:r>
-      <w:r>
-        <w:rPr>
-          <w:lang w:val="es-ES"/>
-        </w:rPr>
-        <w:t>.7</w:t>
-      </w:r>
-      <w:r>
-        <w:rPr>
-          <w:lang w:val="es-ES"/>
-        </w:rPr>
-        <w:t>-</w:t>
+        <w:t>3.7-</w:t>
       </w:r>
       <w:r>
         <w:rPr>
@@ -3092,21 +2749,7 @@
           <w:b/>
           <w:i/>
         </w:rPr>
-        <w:t>17/11/2025-</w:t>
-      </w:r>
-      <w:r>
-        <w:rPr>
-          <w:b/>
-          <w:i/>
-        </w:rPr>
-        <w:t>19/11/2025</w:t>
-      </w:r>
-      <w:r>
-        <w:rPr>
-          <w:b/>
-          <w:i/>
-        </w:rPr>
-        <w:t>]</w:t>
+        <w:t>17/11/2025-19/11/2025]</w:t>
       </w:r>
     </w:p>
     <w:p>
@@ -3198,18 +2841,7 @@
           <w:sz w:val="36"/>
           <w:szCs w:val="36"/>
         </w:rPr>
-        <w:t>(8</w:t>
-      </w:r>
-      <w:r>
-        <w:rPr>
-          <w:rFonts w:ascii="Verdana" w:hAnsi="Verdana"/>
-          <w:i/>
-          <w:iCs/>
-          <w:color w:val="000000" w:themeColor="text1"/>
-          <w:sz w:val="36"/>
-          <w:szCs w:val="36"/>
-        </w:rPr>
-        <w:t xml:space="preserve"> Días)</w:t>
+        <w:t>(8 Días)</w:t>
       </w:r>
     </w:p>
     <w:p>
@@ -3239,13 +2871,7 @@
         <w:rPr>
           <w:lang w:val="es-ES"/>
         </w:rPr>
-        <w:t>4</w:t>
-      </w:r>
-      <w:r>
-        <w:rPr>
-          <w:lang w:val="es-ES"/>
-        </w:rPr>
-        <w:t>.1-</w:t>
+        <w:t>4.1-</w:t>
       </w:r>
       <w:r>
         <w:rPr>
@@ -3286,21 +2912,7 @@
           <w:b/>
           <w:i/>
         </w:rPr>
-        <w:t>20/11/2025-</w:t>
-      </w:r>
-      <w:r>
-        <w:rPr>
-          <w:b/>
-          <w:i/>
-        </w:rPr>
-        <w:t>20/11/2025</w:t>
-      </w:r>
-      <w:r>
-        <w:rPr>
-          <w:b/>
-          <w:i/>
-        </w:rPr>
-        <w:t>]</w:t>
+        <w:t>20/11/2025-20/11/2025]</w:t>
       </w:r>
       <w:r>
         <w:t xml:space="preserve"> </w:t>
@@ -3323,19 +2935,7 @@
         <w:rPr>
           <w:lang w:val="es-ES"/>
         </w:rPr>
-        <w:t>4</w:t>
-      </w:r>
-      <w:r>
-        <w:rPr>
-          <w:lang w:val="es-ES"/>
-        </w:rPr>
-        <w:t>.2</w:t>
-      </w:r>
-      <w:r>
-        <w:rPr>
-          <w:lang w:val="es-ES"/>
-        </w:rPr>
-        <w:t>-</w:t>
+        <w:t>4.2-</w:t>
       </w:r>
       <w:r>
         <w:rPr>
@@ -3370,21 +2970,7 @@
           <w:b/>
           <w:i/>
         </w:rPr>
-        <w:t>21/11/2025-</w:t>
-      </w:r>
-      <w:r>
-        <w:rPr>
-          <w:b/>
-          <w:i/>
-        </w:rPr>
-        <w:t>21/11/2025</w:t>
-      </w:r>
-      <w:r>
-        <w:rPr>
-          <w:b/>
-          <w:i/>
-        </w:rPr>
-        <w:t>]</w:t>
+        <w:t>21/11/2025-21/11/2025]</w:t>
       </w:r>
     </w:p>
     <w:p>
@@ -3404,19 +2990,7 @@
         <w:rPr>
           <w:lang w:val="es-ES"/>
         </w:rPr>
-        <w:t>4</w:t>
-      </w:r>
-      <w:r>
-        <w:rPr>
-          <w:lang w:val="es-ES"/>
-        </w:rPr>
-        <w:t>.3</w:t>
-      </w:r>
-      <w:r>
-        <w:rPr>
-          <w:lang w:val="es-ES"/>
-        </w:rPr>
-        <w:t>-</w:t>
+        <w:t>4.3-</w:t>
       </w:r>
       <w:r>
         <w:rPr>
@@ -3457,21 +3031,7 @@
           <w:b/>
           <w:i/>
         </w:rPr>
-        <w:t>24/11/2025-</w:t>
-      </w:r>
-      <w:r>
-        <w:rPr>
-          <w:b/>
-          <w:i/>
-        </w:rPr>
-        <w:t>24/11/2025</w:t>
-      </w:r>
-      <w:r>
-        <w:rPr>
-          <w:b/>
-          <w:i/>
-        </w:rPr>
-        <w:t>]</w:t>
+        <w:t>24/11/2025-24/11/2025]</w:t>
       </w:r>
     </w:p>
     <w:p>
@@ -3491,19 +3051,7 @@
         <w:rPr>
           <w:lang w:val="es-ES"/>
         </w:rPr>
-        <w:t>4</w:t>
-      </w:r>
-      <w:r>
-        <w:rPr>
-          <w:lang w:val="es-ES"/>
-        </w:rPr>
-        <w:t>.4</w:t>
-      </w:r>
-      <w:r>
-        <w:rPr>
-          <w:lang w:val="es-ES"/>
-        </w:rPr>
-        <w:t>-</w:t>
+        <w:t>4.4-</w:t>
       </w:r>
       <w:r>
         <w:rPr>
@@ -3538,21 +3086,7 @@
           <w:b/>
           <w:i/>
         </w:rPr>
-        <w:t>25/11/2025-</w:t>
-      </w:r>
-      <w:r>
-        <w:rPr>
-          <w:b/>
-          <w:i/>
-        </w:rPr>
-        <w:t>25/11/2025</w:t>
-      </w:r>
-      <w:r>
-        <w:rPr>
-          <w:b/>
-          <w:i/>
-        </w:rPr>
-        <w:t>]</w:t>
+        <w:t>25/11/2025-25/11/2025]</w:t>
       </w:r>
     </w:p>
     <w:p>
@@ -3572,19 +3106,7 @@
         <w:rPr>
           <w:lang w:val="es-ES"/>
         </w:rPr>
-        <w:t>4</w:t>
-      </w:r>
-      <w:r>
-        <w:rPr>
-          <w:lang w:val="es-ES"/>
-        </w:rPr>
-        <w:t>.5</w:t>
-      </w:r>
-      <w:r>
-        <w:rPr>
-          <w:lang w:val="es-ES"/>
-        </w:rPr>
-        <w:t>-</w:t>
+        <w:t>4.5-</w:t>
       </w:r>
       <w:r>
         <w:rPr>
@@ -3643,21 +3165,7 @@
           <w:b/>
           <w:i/>
         </w:rPr>
-        <w:t>26/11/2025-</w:t>
-      </w:r>
-      <w:r>
-        <w:rPr>
-          <w:b/>
-          <w:i/>
-        </w:rPr>
-        <w:t>27/11/2025</w:t>
-      </w:r>
-      <w:r>
-        <w:rPr>
-          <w:b/>
-          <w:i/>
-        </w:rPr>
-        <w:t>]</w:t>
+        <w:t>26/11/2025-27/11/2025]</w:t>
       </w:r>
     </w:p>
     <w:p>
@@ -3677,19 +3185,7 @@
         <w:rPr>
           <w:lang w:val="es-ES"/>
         </w:rPr>
-        <w:t>4</w:t>
-      </w:r>
-      <w:r>
-        <w:rPr>
-          <w:lang w:val="es-ES"/>
-        </w:rPr>
-        <w:t>.6</w:t>
-      </w:r>
-      <w:r>
-        <w:rPr>
-          <w:lang w:val="es-ES"/>
-        </w:rPr>
-        <w:t>-</w:t>
+        <w:t>4.6-</w:t>
       </w:r>
       <w:r>
         <w:rPr>
@@ -3730,21 +3226,7 @@
           <w:b/>
           <w:i/>
         </w:rPr>
-        <w:t>28/11/2025-</w:t>
-      </w:r>
-      <w:r>
-        <w:rPr>
-          <w:b/>
-          <w:i/>
-        </w:rPr>
-        <w:t>28/11/2025</w:t>
-      </w:r>
-      <w:r>
-        <w:rPr>
-          <w:b/>
-          <w:i/>
-        </w:rPr>
-        <w:t>]</w:t>
+        <w:t>28/11/2025-28/11/2025]</w:t>
       </w:r>
     </w:p>
     <w:p>
@@ -3799,21 +3281,7 @@
           <w:b/>
           <w:i/>
         </w:rPr>
-        <w:t>01/12/2025-</w:t>
-      </w:r>
-      <w:r>
-        <w:rPr>
-          <w:b/>
-          <w:i/>
-        </w:rPr>
-        <w:t>01/12/2025</w:t>
-      </w:r>
-      <w:r>
-        <w:rPr>
-          <w:b/>
-          <w:i/>
-        </w:rPr>
-        <w:t>]</w:t>
+        <w:t>01/12/2025-01/12/2025]</w:t>
       </w:r>
     </w:p>
     <w:p>
@@ -3864,9 +3332,8 @@
         </w:rPr>
       </w:pPr>
     </w:p>
-    <w:bookmarkStart w:id="0" w:name="_GoBack"/>
-    <w:bookmarkStart w:id="1" w:name="_MON_1822603599"/>
-    <w:bookmarkEnd w:id="1"/>
+    <w:bookmarkStart w:id="0" w:name="_MON_1822603599"/>
+    <w:bookmarkEnd w:id="0"/>
     <w:p>
       <w:pPr>
         <w:jc w:val="center"/>
@@ -3898,13 +3365,12 @@
             <v:path o:extrusionok="f" gradientshapeok="t" o:connecttype="rect"/>
             <o:lock v:ext="edit" aspectratio="t"/>
           </v:shapetype>
-          <v:shape id="_x0000_i1074" type="#_x0000_t75" style="width:150.85pt;height:96.4pt" o:ole="">
-            <v:imagedata r:id="rId7" o:title=""/>
+          <v:shape id="_x0000_i1025" type="#_x0000_t75" style="width:150.85pt;height:96.4pt" o:ole="">
+            <v:imagedata r:id="rId8" o:title=""/>
           </v:shape>
-          <o:OLEObject Type="Embed" ProgID="Excel.Sheet.12" ShapeID="_x0000_i1074" DrawAspect="Icon" ObjectID="_1822607924" r:id="rId8"/>
+          <o:OLEObject Type="Embed" ProgID="Excel.Sheet.12" ShapeID="_x0000_i1025" DrawAspect="Icon" ObjectID="_1823729264" r:id="rId9"/>
         </w:object>
       </w:r>
-      <w:bookmarkEnd w:id="0"/>
     </w:p>
     <w:p>
       <w:pPr>
@@ -4061,8 +3527,8 @@
           <w:lang w:val="es-ES"/>
         </w:rPr>
         <w:pict w14:anchorId="15F6E2E6">
-          <v:shape id="_x0000_i1059" type="#_x0000_t75" style="width:348.15pt;height:616.05pt">
-            <v:imagedata r:id="rId9" o:title="Diagrama en blanco (1)"/>
+          <v:shape id="_x0000_i1026" type="#_x0000_t75" style="width:348.15pt;height:616.05pt">
+            <v:imagedata r:id="rId10" o:title="Diagrama en blanco (1)"/>
           </v:shape>
         </w:pict>
       </w:r>
@@ -4135,8 +3601,8 @@
           <w:i/>
         </w:rPr>
         <w:pict w14:anchorId="23E29F4E">
-          <v:shape id="_x0000_i1061" type="#_x0000_t75" style="width:289.05pt;height:631.7pt">
-            <v:imagedata r:id="rId10" o:title="Diagrama en blanco"/>
+          <v:shape id="_x0000_i1027" type="#_x0000_t75" style="width:289.05pt;height:631.7pt">
+            <v:imagedata r:id="rId11" o:title="Diagrama en blanco"/>
           </v:shape>
         </w:pict>
       </w:r>
@@ -4228,8 +3694,8 @@
           <w:szCs w:val="48"/>
         </w:rPr>
         <w:pict w14:anchorId="1E0B517C">
-          <v:shape id="_x0000_i1066" type="#_x0000_t75" style="width:276.7pt;height:648.2pt">
-            <v:imagedata r:id="rId11" o:title="Diagrama en blanco (2)"/>
+          <v:shape id="_x0000_i1028" type="#_x0000_t75" style="width:276.7pt;height:648.2pt">
+            <v:imagedata r:id="rId12" o:title="Diagrama en blanco (2)"/>
           </v:shape>
         </w:pict>
       </w:r>
@@ -4245,13 +3711,126 @@
           <w:szCs w:val="48"/>
         </w:rPr>
       </w:pPr>
-    </w:p>
-    <w:p>
-      <w:pPr>
-        <w:rPr>
-          <w:lang w:val="es-ES"/>
-        </w:rPr>
-      </w:pPr>
+      <w:r>
+        <w:rPr>
+          <w:rFonts w:ascii="Verdana" w:hAnsi="Verdana"/>
+          <w:i/>
+          <w:iCs/>
+          <w:color w:val="730000" w:themeColor="accent1" w:themeShade="BF"/>
+          <w:sz w:val="48"/>
+          <w:szCs w:val="48"/>
+        </w:rPr>
+        <w:lastRenderedPageBreak/>
+        <w:t xml:space="preserve">DFD Nivel 0 </w:t>
+      </w:r>
+    </w:p>
+    <w:p>
+      <w:pPr>
+        <w:rPr>
+          <w:lang w:val="es-ES"/>
+        </w:rPr>
+      </w:pPr>
+    </w:p>
+    <w:p>
+      <w:pPr>
+        <w:rPr>
+          <w:lang w:val="es-ES"/>
+        </w:rPr>
+      </w:pPr>
+    </w:p>
+    <w:p>
+      <w:pPr>
+        <w:rPr>
+          <w:lang w:val="es-ES"/>
+        </w:rPr>
+      </w:pPr>
+      <w:r>
+        <w:rPr>
+          <w:lang w:val="es-ES"/>
+        </w:rPr>
+        <w:t>A continuación, se desarrolla el DFD de nivel 0 sobre los métodos implementados para el proyecto</w:t>
+      </w:r>
+      <w:r>
+        <w:rPr>
+          <w:lang w:val="es-ES"/>
+        </w:rPr>
+        <w:t>.</w:t>
+      </w:r>
+    </w:p>
+    <w:p>
+      <w:pPr>
+        <w:rPr>
+          <w:lang w:val="es-ES"/>
+        </w:rPr>
+      </w:pPr>
+    </w:p>
+    <w:p>
+      <w:pPr>
+        <w:rPr>
+          <w:lang w:val="es-ES"/>
+        </w:rPr>
+      </w:pPr>
+      <w:r>
+        <w:rPr>
+          <w:noProof/>
+          <w:lang w:val="en-US"/>
+        </w:rPr>
+        <w:drawing>
+          <wp:anchor distT="0" distB="0" distL="114300" distR="114300" simplePos="0" relativeHeight="251665408" behindDoc="1" locked="0" layoutInCell="1" allowOverlap="1" wp14:anchorId="5623D0AF" wp14:editId="05084444">
+            <wp:simplePos x="0" y="0"/>
+            <wp:positionH relativeFrom="margin">
+              <wp:align>center</wp:align>
+            </wp:positionH>
+            <wp:positionV relativeFrom="paragraph">
+              <wp:posOffset>422095</wp:posOffset>
+            </wp:positionV>
+            <wp:extent cx="6726175" cy="3370997"/>
+            <wp:effectExtent l="0" t="0" r="0" b="1270"/>
+            <wp:wrapNone/>
+            <wp:docPr id="1" name="Imagen 1"/>
+            <wp:cNvGraphicFramePr>
+              <a:graphicFrameLocks xmlns:a="http://schemas.openxmlformats.org/drawingml/2006/main" noChangeAspect="1"/>
+            </wp:cNvGraphicFramePr>
+            <a:graphic xmlns:a="http://schemas.openxmlformats.org/drawingml/2006/main">
+              <a:graphicData uri="http://schemas.openxmlformats.org/drawingml/2006/picture">
+                <pic:pic xmlns:pic="http://schemas.openxmlformats.org/drawingml/2006/picture">
+                  <pic:nvPicPr>
+                    <pic:cNvPr id="1" name="DFD Nivel 0 .png"/>
+                    <pic:cNvPicPr/>
+                  </pic:nvPicPr>
+                  <pic:blipFill>
+                    <a:blip r:embed="rId13" cstate="print">
+                      <a:extLst>
+                        <a:ext uri="{28A0092B-C50C-407E-A947-70E740481C1C}">
+                          <a14:useLocalDpi xmlns:a14="http://schemas.microsoft.com/office/drawing/2010/main" val="0"/>
+                        </a:ext>
+                      </a:extLst>
+                    </a:blip>
+                    <a:stretch>
+                      <a:fillRect/>
+                    </a:stretch>
+                  </pic:blipFill>
+                  <pic:spPr>
+                    <a:xfrm>
+                      <a:off x="0" y="0"/>
+                      <a:ext cx="6726175" cy="3370997"/>
+                    </a:xfrm>
+                    <a:prstGeom prst="rect">
+                      <a:avLst/>
+                    </a:prstGeom>
+                  </pic:spPr>
+                </pic:pic>
+              </a:graphicData>
+            </a:graphic>
+            <wp14:sizeRelH relativeFrom="margin">
+              <wp14:pctWidth>0</wp14:pctWidth>
+            </wp14:sizeRelH>
+            <wp14:sizeRelV relativeFrom="margin">
+              <wp14:pctHeight>0</wp14:pctHeight>
+            </wp14:sizeRelV>
+          </wp:anchor>
+        </w:drawing>
+      </w:r>
       <w:r>
         <w:rPr>
           <w:lang w:val="es-ES"/>
@@ -4330,6 +3909,83 @@
         </w:rPr>
         <w:tab/>
       </w:r>
+    </w:p>
+    <w:p>
+      <w:pPr>
+        <w:rPr>
+          <w:lang w:val="es-ES"/>
+        </w:rPr>
+      </w:pPr>
+    </w:p>
+    <w:p>
+      <w:pPr>
+        <w:rPr>
+          <w:lang w:val="es-ES"/>
+        </w:rPr>
+      </w:pPr>
+    </w:p>
+    <w:p>
+      <w:pPr>
+        <w:rPr>
+          <w:lang w:val="es-ES"/>
+        </w:rPr>
+      </w:pPr>
+    </w:p>
+    <w:p>
+      <w:pPr>
+        <w:rPr>
+          <w:lang w:val="es-ES"/>
+        </w:rPr>
+      </w:pPr>
+    </w:p>
+    <w:p>
+      <w:pPr>
+        <w:rPr>
+          <w:lang w:val="es-ES"/>
+        </w:rPr>
+      </w:pPr>
+    </w:p>
+    <w:p>
+      <w:pPr>
+        <w:rPr>
+          <w:lang w:val="es-ES"/>
+        </w:rPr>
+      </w:pPr>
+    </w:p>
+    <w:p>
+      <w:pPr>
+        <w:rPr>
+          <w:lang w:val="es-ES"/>
+        </w:rPr>
+      </w:pPr>
+    </w:p>
+    <w:p>
+      <w:pPr>
+        <w:rPr>
+          <w:lang w:val="es-ES"/>
+        </w:rPr>
+      </w:pPr>
+    </w:p>
+    <w:p>
+      <w:pPr>
+        <w:rPr>
+          <w:lang w:val="es-ES"/>
+        </w:rPr>
+      </w:pPr>
+    </w:p>
+    <w:p>
+      <w:pPr>
+        <w:rPr>
+          <w:lang w:val="es-ES"/>
+        </w:rPr>
+      </w:pPr>
+    </w:p>
+    <w:p>
+      <w:pPr>
+        <w:rPr>
+          <w:lang w:val="es-ES"/>
+        </w:rPr>
+      </w:pPr>
       <w:r>
         <w:rPr>
           <w:lang w:val="es-ES"/>
@@ -4360,17 +4016,197 @@
         </w:rPr>
         <w:tab/>
       </w:r>
-      <w:r>
-        <w:rPr>
-          <w:lang w:val="es-ES"/>
-        </w:rPr>
-        <w:br/>
-      </w:r>
-    </w:p>
-    <w:p>
-      <w:pPr>
-        <w:jc w:val="right"/>
-      </w:pPr>
+    </w:p>
+    <w:p>
+      <w:pPr>
+        <w:rPr>
+          <w:rFonts w:ascii="Verdana" w:hAnsi="Verdana"/>
+          <w:i/>
+          <w:iCs/>
+          <w:color w:val="730000" w:themeColor="accent1" w:themeShade="BF"/>
+          <w:sz w:val="48"/>
+          <w:szCs w:val="48"/>
+        </w:rPr>
+      </w:pPr>
+    </w:p>
+    <w:p>
+      <w:pPr>
+        <w:rPr>
+          <w:rFonts w:ascii="Verdana" w:hAnsi="Verdana"/>
+          <w:i/>
+          <w:iCs/>
+          <w:color w:val="730000" w:themeColor="accent1" w:themeShade="BF"/>
+          <w:sz w:val="48"/>
+          <w:szCs w:val="48"/>
+        </w:rPr>
+      </w:pPr>
+    </w:p>
+    <w:p>
+      <w:pPr>
+        <w:rPr>
+          <w:rFonts w:ascii="Verdana" w:hAnsi="Verdana"/>
+          <w:i/>
+          <w:iCs/>
+          <w:color w:val="730000" w:themeColor="accent1" w:themeShade="BF"/>
+          <w:sz w:val="48"/>
+          <w:szCs w:val="48"/>
+        </w:rPr>
+      </w:pPr>
+    </w:p>
+    <w:p>
+      <w:pPr>
+        <w:rPr>
+          <w:rFonts w:ascii="Verdana" w:hAnsi="Verdana"/>
+          <w:i/>
+          <w:iCs/>
+          <w:color w:val="730000" w:themeColor="accent1" w:themeShade="BF"/>
+          <w:sz w:val="48"/>
+          <w:szCs w:val="48"/>
+        </w:rPr>
+      </w:pPr>
+    </w:p>
+    <w:p>
+      <w:pPr>
+        <w:rPr>
+          <w:rFonts w:ascii="Verdana" w:hAnsi="Verdana"/>
+          <w:i/>
+          <w:iCs/>
+          <w:color w:val="730000" w:themeColor="accent1" w:themeShade="BF"/>
+          <w:sz w:val="48"/>
+          <w:szCs w:val="48"/>
+        </w:rPr>
+      </w:pPr>
+    </w:p>
+    <w:p>
+      <w:pPr>
+        <w:rPr>
+          <w:lang w:val="es-ES"/>
+        </w:rPr>
+      </w:pPr>
+      <w:r>
+        <w:rPr>
+          <w:rFonts w:ascii="Verdana" w:hAnsi="Verdana"/>
+          <w:i/>
+          <w:iCs/>
+          <w:color w:val="730000" w:themeColor="accent1" w:themeShade="BF"/>
+          <w:sz w:val="48"/>
+          <w:szCs w:val="48"/>
+        </w:rPr>
+        <w:lastRenderedPageBreak/>
+        <w:t>DFD Nivel 1</w:t>
+      </w:r>
+      <w:r>
+        <w:rPr>
+          <w:rFonts w:ascii="Verdana" w:hAnsi="Verdana"/>
+          <w:i/>
+          <w:iCs/>
+          <w:color w:val="730000" w:themeColor="accent1" w:themeShade="BF"/>
+          <w:sz w:val="48"/>
+          <w:szCs w:val="48"/>
+        </w:rPr>
+        <w:t xml:space="preserve"> </w:t>
+      </w:r>
+    </w:p>
+    <w:p>
+      <w:pPr>
+        <w:rPr>
+          <w:lang w:val="es-ES"/>
+        </w:rPr>
+      </w:pPr>
+      <w:r>
+        <w:rPr>
+          <w:lang w:val="es-ES"/>
+        </w:rPr>
+        <w:t>A continuación,</w:t>
+      </w:r>
+      <w:r>
+        <w:rPr>
+          <w:lang w:val="es-ES"/>
+        </w:rPr>
+        <w:t xml:space="preserve"> se desarrolla el DFD de nivel 1</w:t>
+      </w:r>
+      <w:r>
+        <w:rPr>
+          <w:lang w:val="es-ES"/>
+        </w:rPr>
+        <w:t xml:space="preserve"> sobre los métodos implementados para el proyecto</w:t>
+      </w:r>
+      <w:r>
+        <w:rPr>
+          <w:lang w:val="es-ES"/>
+        </w:rPr>
+        <w:t>.</w:t>
+      </w:r>
+    </w:p>
+    <w:p>
+      <w:pPr>
+        <w:rPr>
+          <w:lang w:val="es-ES"/>
+        </w:rPr>
+      </w:pPr>
+      <w:bookmarkStart w:id="1" w:name="_GoBack"/>
+      <w:bookmarkEnd w:id="1"/>
+      <w:r>
+        <w:rPr>
+          <w:noProof/>
+          <w:lang w:val="en-US"/>
+        </w:rPr>
+        <w:drawing>
+          <wp:anchor distT="0" distB="0" distL="114300" distR="114300" simplePos="0" relativeHeight="251666432" behindDoc="1" locked="0" layoutInCell="1" allowOverlap="1" wp14:anchorId="4941FE0C" wp14:editId="7CF3DFAA">
+            <wp:simplePos x="0" y="0"/>
+            <wp:positionH relativeFrom="margin">
+              <wp:align>center</wp:align>
+            </wp:positionH>
+            <wp:positionV relativeFrom="paragraph">
+              <wp:posOffset>793418</wp:posOffset>
+            </wp:positionV>
+            <wp:extent cx="6969046" cy="4217158"/>
+            <wp:effectExtent l="0" t="0" r="3810" b="0"/>
+            <wp:wrapNone/>
+            <wp:docPr id="3" name="Imagen 3"/>
+            <wp:cNvGraphicFramePr>
+              <a:graphicFrameLocks xmlns:a="http://schemas.openxmlformats.org/drawingml/2006/main" noChangeAspect="1"/>
+            </wp:cNvGraphicFramePr>
+            <a:graphic xmlns:a="http://schemas.openxmlformats.org/drawingml/2006/main">
+              <a:graphicData uri="http://schemas.openxmlformats.org/drawingml/2006/picture">
+                <pic:pic xmlns:pic="http://schemas.openxmlformats.org/drawingml/2006/picture">
+                  <pic:nvPicPr>
+                    <pic:cNvPr id="3" name="DFD Nivel 1.png"/>
+                    <pic:cNvPicPr/>
+                  </pic:nvPicPr>
+                  <pic:blipFill>
+                    <a:blip r:embed="rId14" cstate="print">
+                      <a:extLst>
+                        <a:ext uri="{28A0092B-C50C-407E-A947-70E740481C1C}">
+                          <a14:useLocalDpi xmlns:a14="http://schemas.microsoft.com/office/drawing/2010/main" val="0"/>
+                        </a:ext>
+                      </a:extLst>
+                    </a:blip>
+                    <a:stretch>
+                      <a:fillRect/>
+                    </a:stretch>
+                  </pic:blipFill>
+                  <pic:spPr>
+                    <a:xfrm>
+                      <a:off x="0" y="0"/>
+                      <a:ext cx="6969046" cy="4217158"/>
+                    </a:xfrm>
+                    <a:prstGeom prst="rect">
+                      <a:avLst/>
+                    </a:prstGeom>
+                  </pic:spPr>
+                </pic:pic>
+              </a:graphicData>
+            </a:graphic>
+            <wp14:sizeRelH relativeFrom="margin">
+              <wp14:pctWidth>0</wp14:pctWidth>
+            </wp14:sizeRelH>
+            <wp14:sizeRelV relativeFrom="margin">
+              <wp14:pctHeight>0</wp14:pctHeight>
+            </wp14:sizeRelV>
+          </wp:anchor>
+        </w:drawing>
+      </w:r>
     </w:p>
     <w:sectPr>
       <w:pgSz w:w="11906" w:h="16838"/>
@@ -5364,7 +5200,7 @@
   <w:style w:type="paragraph" w:default="1" w:styleId="Normal">
     <w:name w:val="Normal"/>
     <w:qFormat/>
-    <w:rsid w:val="00164356"/>
+    <w:rsid w:val="00400A6F"/>
   </w:style>
   <w:style w:type="paragraph" w:styleId="Ttulo1">
     <w:name w:val="heading 1"/>

</xml_diff>

<commit_message>
Añado Dfd Nivel 0 y 1
</commit_message>
<xml_diff>
--- a/DocDelProyectoGarciaDelfabro.docx
+++ b/DocDelProyectoGarciaDelfabro.docx
@@ -375,7 +375,7 @@
                   </wp:anchor>
                 </w:drawing>
               </mc:Choice>
-              <mc:Fallback xmlns:cx2="http://schemas.microsoft.com/office/drawing/2015/10/21/chartex" xmlns:cx3="http://schemas.microsoft.com/office/drawing/2016/5/9/chartex" xmlns:cx4="http://schemas.microsoft.com/office/drawing/2016/5/10/chartex" xmlns:cx5="http://schemas.microsoft.com/office/drawing/2016/5/11/chartex" xmlns:cx6="http://schemas.microsoft.com/office/drawing/2016/5/12/chartex" xmlns:cx7="http://schemas.microsoft.com/office/drawing/2016/5/13/chartex" xmlns:cx8="http://schemas.microsoft.com/office/drawing/2016/5/14/chartex" xmlns:aink="http://schemas.microsoft.com/office/drawing/2016/ink" xmlns:am3d="http://schemas.microsoft.com/office/drawing/2017/model3d" xmlns:oel="http://schemas.microsoft.com/office/2019/extlst" xmlns:w16cex="http://schemas.microsoft.com/office/word/2018/wordml/cex" xmlns:w16cid="http://schemas.microsoft.com/office/word/2016/wordml/cid" xmlns:w16="http://schemas.microsoft.com/office/word/2018/wordml" xmlns:w16du="http://schemas.microsoft.com/office/word/2023/wordml/word16du" xmlns:w16sdtdh="http://schemas.microsoft.com/office/word/2020/wordml/sdtdatahash" xmlns:w16sdtfl="http://schemas.microsoft.com/office/word/2024/wordml/sdtformatlock">
+              <mc:Fallback xmlns:w16sdtfl="http://schemas.microsoft.com/office/word/2024/wordml/sdtformatlock" xmlns:w16sdtdh="http://schemas.microsoft.com/office/word/2020/wordml/sdtdatahash" xmlns:w16du="http://schemas.microsoft.com/office/word/2023/wordml/word16du" xmlns:w16="http://schemas.microsoft.com/office/word/2018/wordml" xmlns:w16cid="http://schemas.microsoft.com/office/word/2016/wordml/cid" xmlns:w16cex="http://schemas.microsoft.com/office/word/2018/wordml/cex" xmlns:oel="http://schemas.microsoft.com/office/2019/extlst" xmlns:am3d="http://schemas.microsoft.com/office/drawing/2017/model3d" xmlns:aink="http://schemas.microsoft.com/office/drawing/2016/ink" xmlns:cx8="http://schemas.microsoft.com/office/drawing/2016/5/14/chartex" xmlns:cx7="http://schemas.microsoft.com/office/drawing/2016/5/13/chartex" xmlns:cx6="http://schemas.microsoft.com/office/drawing/2016/5/12/chartex" xmlns:cx5="http://schemas.microsoft.com/office/drawing/2016/5/11/chartex" xmlns:cx4="http://schemas.microsoft.com/office/drawing/2016/5/10/chartex" xmlns:cx3="http://schemas.microsoft.com/office/drawing/2016/5/9/chartex" xmlns:cx2="http://schemas.microsoft.com/office/drawing/2015/10/21/chartex">
                 <w:pict>
                   <v:rect w14:anchorId="07684F74" id="Rectángulo 261" o:spid="_x0000_s1026" style="position:absolute;margin-left:0;margin-top:0;width:244.8pt;height:554.4pt;z-index:251659264;visibility:visible;mso-wrap-style:square;mso-width-percent:400;mso-height-percent:700;mso-left-percent:440;mso-top-percent:25;mso-wrap-distance-left:9pt;mso-wrap-distance-top:0;mso-wrap-distance-right:9pt;mso-wrap-distance-bottom:0;mso-position-horizontal-relative:page;mso-position-vertical-relative:page;mso-width-percent:400;mso-height-percent:700;mso-left-percent:440;mso-top-percent:25;mso-width-relative:page;mso-height-relative:page;v-text-anchor:middle" o:gfxdata="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" fillcolor="white [3212]" strokecolor="#747070 [1614]" strokeweight="1.25pt">
                     <w10:wrap anchorx="page" anchory="page"/>
@@ -473,7 +473,7 @@
                   </wp:anchor>
                 </w:drawing>
               </mc:Choice>
-              <mc:Fallback xmlns:cx2="http://schemas.microsoft.com/office/drawing/2015/10/21/chartex" xmlns:cx3="http://schemas.microsoft.com/office/drawing/2016/5/9/chartex" xmlns:cx4="http://schemas.microsoft.com/office/drawing/2016/5/10/chartex" xmlns:cx5="http://schemas.microsoft.com/office/drawing/2016/5/11/chartex" xmlns:cx6="http://schemas.microsoft.com/office/drawing/2016/5/12/chartex" xmlns:cx7="http://schemas.microsoft.com/office/drawing/2016/5/13/chartex" xmlns:cx8="http://schemas.microsoft.com/office/drawing/2016/5/14/chartex" xmlns:aink="http://schemas.microsoft.com/office/drawing/2016/ink" xmlns:am3d="http://schemas.microsoft.com/office/drawing/2017/model3d" xmlns:oel="http://schemas.microsoft.com/office/2019/extlst" xmlns:w16cex="http://schemas.microsoft.com/office/word/2018/wordml/cex" xmlns:w16cid="http://schemas.microsoft.com/office/word/2016/wordml/cid" xmlns:w16="http://schemas.microsoft.com/office/word/2018/wordml" xmlns:w16du="http://schemas.microsoft.com/office/word/2023/wordml/word16du" xmlns:w16sdtdh="http://schemas.microsoft.com/office/word/2020/wordml/sdtdatahash" xmlns:w16sdtfl="http://schemas.microsoft.com/office/word/2024/wordml/sdtformatlock">
+              <mc:Fallback xmlns:w16sdtfl="http://schemas.microsoft.com/office/word/2024/wordml/sdtformatlock" xmlns:w16sdtdh="http://schemas.microsoft.com/office/word/2020/wordml/sdtdatahash" xmlns:w16du="http://schemas.microsoft.com/office/word/2023/wordml/word16du" xmlns:w16="http://schemas.microsoft.com/office/word/2018/wordml" xmlns:w16cid="http://schemas.microsoft.com/office/word/2016/wordml/cid" xmlns:w16cex="http://schemas.microsoft.com/office/word/2018/wordml/cex" xmlns:oel="http://schemas.microsoft.com/office/2019/extlst" xmlns:am3d="http://schemas.microsoft.com/office/drawing/2017/model3d" xmlns:aink="http://schemas.microsoft.com/office/drawing/2016/ink" xmlns:cx8="http://schemas.microsoft.com/office/drawing/2016/5/14/chartex" xmlns:cx7="http://schemas.microsoft.com/office/drawing/2016/5/13/chartex" xmlns:cx6="http://schemas.microsoft.com/office/drawing/2016/5/12/chartex" xmlns:cx5="http://schemas.microsoft.com/office/drawing/2016/5/11/chartex" xmlns:cx4="http://schemas.microsoft.com/office/drawing/2016/5/10/chartex" xmlns:cx3="http://schemas.microsoft.com/office/drawing/2016/5/9/chartex" xmlns:cx2="http://schemas.microsoft.com/office/drawing/2015/10/21/chartex">
                 <w:pict>
                   <v:rect w14:anchorId="00A61A94" id="Rectángulo 263" o:spid="_x0000_s1026" style="position:absolute;margin-left:0;margin-top:0;width:226.45pt;height:9.35pt;z-index:251662336;visibility:visible;mso-wrap-style:square;mso-width-percent:370;mso-height-percent:0;mso-left-percent:455;mso-top-percent:690;mso-wrap-distance-left:9pt;mso-wrap-distance-top:0;mso-wrap-distance-right:9pt;mso-wrap-distance-bottom:0;mso-position-horizontal-relative:page;mso-position-vertical-relative:page;mso-width-percent:370;mso-height-percent:0;mso-left-percent:455;mso-top-percent:690;mso-width-relative:page;mso-height-relative:margin;v-text-anchor:middle" o:gfxdata="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" fillcolor="#9a0000 [3204]" stroked="f" strokeweight="1pt">
                     <w10:wrap anchorx="page" anchory="page"/>
@@ -3365,10 +3365,10 @@
             <v:path o:extrusionok="f" gradientshapeok="t" o:connecttype="rect"/>
             <o:lock v:ext="edit" aspectratio="t"/>
           </v:shapetype>
-          <v:shape id="_x0000_i1025" type="#_x0000_t75" style="width:150.85pt;height:96.4pt" o:ole="">
+          <v:shape id="_x0000_i1025" type="#_x0000_t75" style="width:151pt;height:96.2pt" o:ole="">
             <v:imagedata r:id="rId8" o:title=""/>
           </v:shape>
-          <o:OLEObject Type="Embed" ProgID="Excel.Sheet.12" ShapeID="_x0000_i1025" DrawAspect="Icon" ObjectID="_1823729264" r:id="rId9"/>
+          <o:OLEObject Type="Embed" ProgID="Excel.Sheet.12" ShapeID="_x0000_i1025" DrawAspect="Icon" ObjectID="_1823780397" r:id="rId9"/>
         </w:object>
       </w:r>
     </w:p>
@@ -3527,7 +3527,7 @@
           <w:lang w:val="es-ES"/>
         </w:rPr>
         <w:pict w14:anchorId="15F6E2E6">
-          <v:shape id="_x0000_i1026" type="#_x0000_t75" style="width:348.15pt;height:616.05pt">
+          <v:shape id="_x0000_i1026" type="#_x0000_t75" style="width:348.2pt;height:615.75pt">
             <v:imagedata r:id="rId10" o:title="Diagrama en blanco (1)"/>
           </v:shape>
         </w:pict>
@@ -3601,7 +3601,7 @@
           <w:i/>
         </w:rPr>
         <w:pict w14:anchorId="23E29F4E">
-          <v:shape id="_x0000_i1027" type="#_x0000_t75" style="width:289.05pt;height:631.7pt">
+          <v:shape id="_x0000_i1027" type="#_x0000_t75" style="width:289.05pt;height:631.9pt">
             <v:imagedata r:id="rId11" o:title="Diagrama en blanco"/>
           </v:shape>
         </w:pict>
@@ -3694,7 +3694,7 @@
           <w:szCs w:val="48"/>
         </w:rPr>
         <w:pict w14:anchorId="1E0B517C">
-          <v:shape id="_x0000_i1028" type="#_x0000_t75" style="width:276.7pt;height:648.2pt">
+          <v:shape id="_x0000_i1028" type="#_x0000_t75" style="width:276.7pt;height:9in">
             <v:imagedata r:id="rId12" o:title="Diagrama en blanco (2)"/>
           </v:shape>
         </w:pict>
@@ -4093,18 +4093,7 @@
           <w:szCs w:val="48"/>
         </w:rPr>
         <w:lastRenderedPageBreak/>
-        <w:t>DFD Nivel 1</w:t>
-      </w:r>
-      <w:r>
-        <w:rPr>
-          <w:rFonts w:ascii="Verdana" w:hAnsi="Verdana"/>
-          <w:i/>
-          <w:iCs/>
-          <w:color w:val="730000" w:themeColor="accent1" w:themeShade="BF"/>
-          <w:sz w:val="48"/>
-          <w:szCs w:val="48"/>
-        </w:rPr>
-        <w:t xml:space="preserve"> </w:t>
+        <w:t xml:space="preserve">DFD Nivel 1 </w:t>
       </w:r>
     </w:p>
     <w:p>
@@ -4129,41 +4118,47 @@
         <w:rPr>
           <w:lang w:val="es-ES"/>
         </w:rPr>
-        <w:t xml:space="preserve"> sobre los métodos implementados para el proyecto</w:t>
-      </w:r>
-      <w:r>
-        <w:rPr>
-          <w:lang w:val="es-ES"/>
-        </w:rPr>
-        <w:t>.</w:t>
-      </w:r>
-    </w:p>
-    <w:p>
-      <w:pPr>
-        <w:rPr>
-          <w:lang w:val="es-ES"/>
-        </w:rPr>
-      </w:pPr>
+        <w:t xml:space="preserve"> sobre los métodos implementados para </w:t>
+      </w:r>
       <w:bookmarkStart w:id="1" w:name="_GoBack"/>
       <w:bookmarkEnd w:id="1"/>
       <w:r>
         <w:rPr>
+          <w:lang w:val="es-ES"/>
+        </w:rPr>
+        <w:t>el proyecto</w:t>
+      </w:r>
+      <w:r>
+        <w:rPr>
+          <w:lang w:val="es-ES"/>
+        </w:rPr>
+        <w:t>.</w:t>
+      </w:r>
+    </w:p>
+    <w:p>
+      <w:pPr>
+        <w:rPr>
+          <w:lang w:val="es-ES"/>
+        </w:rPr>
+      </w:pPr>
+      <w:r>
+        <w:rPr>
           <w:noProof/>
           <w:lang w:val="en-US"/>
         </w:rPr>
         <w:drawing>
-          <wp:anchor distT="0" distB="0" distL="114300" distR="114300" simplePos="0" relativeHeight="251666432" behindDoc="1" locked="0" layoutInCell="1" allowOverlap="1" wp14:anchorId="4941FE0C" wp14:editId="7CF3DFAA">
+          <wp:anchor distT="0" distB="0" distL="114300" distR="114300" simplePos="0" relativeHeight="251666432" behindDoc="1" locked="0" layoutInCell="1" allowOverlap="1" wp14:anchorId="386F3AD9" wp14:editId="29C9E318">
             <wp:simplePos x="0" y="0"/>
             <wp:positionH relativeFrom="margin">
               <wp:align>center</wp:align>
             </wp:positionH>
             <wp:positionV relativeFrom="paragraph">
-              <wp:posOffset>793418</wp:posOffset>
+              <wp:posOffset>302327</wp:posOffset>
             </wp:positionV>
-            <wp:extent cx="6969046" cy="4217158"/>
-            <wp:effectExtent l="0" t="0" r="3810" b="0"/>
+            <wp:extent cx="7618857" cy="3275463"/>
+            <wp:effectExtent l="0" t="0" r="1270" b="1270"/>
             <wp:wrapNone/>
-            <wp:docPr id="3" name="Imagen 3"/>
+            <wp:docPr id="4" name="Imagen 4"/>
             <wp:cNvGraphicFramePr>
               <a:graphicFrameLocks xmlns:a="http://schemas.openxmlformats.org/drawingml/2006/main" noChangeAspect="1"/>
             </wp:cNvGraphicFramePr>
@@ -4171,7 +4166,7 @@
               <a:graphicData uri="http://schemas.openxmlformats.org/drawingml/2006/picture">
                 <pic:pic xmlns:pic="http://schemas.openxmlformats.org/drawingml/2006/picture">
                   <pic:nvPicPr>
-                    <pic:cNvPr id="3" name="DFD Nivel 1.png"/>
+                    <pic:cNvPr id="4" name="dfd1BienHecho.png"/>
                     <pic:cNvPicPr/>
                   </pic:nvPicPr>
                   <pic:blipFill>
@@ -4189,7 +4184,7 @@
                   <pic:spPr>
                     <a:xfrm>
                       <a:off x="0" y="0"/>
-                      <a:ext cx="6969046" cy="4217158"/>
+                      <a:ext cx="7618857" cy="3275463"/>
                     </a:xfrm>
                     <a:prstGeom prst="rect">
                       <a:avLst/>

</xml_diff>